<commit_message>
Remove legacy simulation acronym from project
</commit_message>
<xml_diff>
--- a/outputs/wafer_process_signature_triage_report.docx
+++ b/outputs/wafer_process_signature_triage_report.docx
@@ -102,7 +102,7 @@
               <w:t xml:space="preserve">Evidence boundary  </w:t>
             </w:r>
             <w:r>
-              <w:t>This is a reproducible classifier and triage prototype evaluated on the shared 902-image Kaggle JPEG derivative. It is not TCAD simulation, root-cause diagnosis, or validation on A*STAR IME fab data.</w:t>
+              <w:t>This is a reproducible classifier and triage prototype evaluated on the shared 902-image Kaggle JPEG derivative. It is not physics simulation, root-cause diagnosis, or validation on A*STAR IME fab data.</w:t>
             </w:r>
           </w:p>
         </w:tc>
@@ -171,7 +171,7 @@
         <w:pStyle w:val="Heading1"/>
       </w:pPr>
       <w:r>
-        <w:t>Semiconductor and Process TCAD problem</w:t>
+        <w:t>Semiconductor process-analysis problem</w:t>
       </w:r>
     </w:p>
     <w:p>

</xml_diff>